<commit_message>
Modify german.txt and replace hamlet.docx
</commit_message>
<xml_diff>
--- a/hamlet.docx
+++ b/hamlet.docx
@@ -4,9 +4,16 @@
   <w:body>
     <w:p>
       <w:r>
-        <w:t>This is a Microsoft word document.</w:t>
+        <w:t xml:space="preserve">This is a Microsoft word document.  </w:t>
+      </w:r>
+      <w:r>
+        <w:rPr>
+          <w:color w:val="C00000"/>
+        </w:rPr>
+        <w:t>(This is a change – Version for branch alternate)</w:t>
       </w:r>
     </w:p>
+    <w:p/>
     <w:p>
       <w:r>
         <w:t>It will be treated as a binary file by Git.</w:t>
@@ -807,7 +814,7 @@
   <w:style w:type="character" w:customStyle="1" w:styleId="apple-converted-space">
     <w:name w:val="apple-converted-space"/>
     <w:basedOn w:val="DefaultParagraphFont"/>
-    <w:rsid w:val="00F3117F"/>
+    <w:rsid w:val="00121F96"/>
   </w:style>
 </w:styles>
 </file>

</xml_diff>

<commit_message>
Modify german.txt and added hamlet.docx from main.docx
</commit_message>
<xml_diff>
--- a/hamlet.docx
+++ b/hamlet.docx
@@ -4,9 +4,28 @@
   <w:body>
     <w:p>
       <w:r>
-        <w:t>This is a Microsoft word document.</w:t>
+        <w:t xml:space="preserve">This is a Microsoft word document.  </w:t>
+      </w:r>
+      <w:r>
+        <w:rPr>
+          <w:color w:val="C00000"/>
+        </w:rPr>
+        <w:t xml:space="preserve">(This is a change – Version for branch </w:t>
+      </w:r>
+      <w:r>
+        <w:rPr>
+          <w:color w:val="C00000"/>
+        </w:rPr>
+        <w:t>main</w:t>
+      </w:r>
+      <w:r>
+        <w:rPr>
+          <w:color w:val="C00000"/>
+        </w:rPr>
+        <w:t>)</w:t>
       </w:r>
     </w:p>
+    <w:p/>
     <w:p>
       <w:r>
         <w:t>It will be treated as a binary file by Git.</w:t>
@@ -807,7 +826,7 @@
   <w:style w:type="character" w:customStyle="1" w:styleId="apple-converted-space">
     <w:name w:val="apple-converted-space"/>
     <w:basedOn w:val="DefaultParagraphFont"/>
-    <w:rsid w:val="00F3117F"/>
+    <w:rsid w:val="0023304F"/>
   </w:style>
 </w:styles>
 </file>

</xml_diff>